<commit_message>
Correct standalone application documentation
</commit_message>
<xml_diff>
--- a/submission/Madhavik_Dogra_Founding_AI_Engineer_Assignment.docx
+++ b/submission/Madhavik_Dogra_Founding_AI_Engineer_Assignment.docx
@@ -317,7 +317,7 @@
           <w:color w:val="1D2530"/>
           <w:sz w:val="22"/>
         </w:rPr>
-        <w:t>ChangeScope is a static Vite application written in vanilla HTML, CSS, and JavaScript. It has no server, database, authentication layer, or external API requirement. This is intentional: for an assignment demo, I wanted the central product interaction to be reliable, inspectable, and deployable at zero marginal cost.</w:t>
+        <w:t>ChangeScope is a standalone static application written in vanilla HTML, CSS, and JavaScript. It has no server, database, authentication layer, or external API requirement. This is intentional: for an assignment demo, I wanted the central product interaction to be reliable, inspectable, and deployable at zero marginal cost.</w:t>
       </w:r>
     </w:p>
     <w:tbl>
@@ -878,7 +878,7 @@
           <w:color w:val="1D2530"/>
           <w:sz w:val="22"/>
         </w:rPr>
-        <w:t>Clone the repository, run npm install, then run npm run start. For a production bundle, run npm run build. The project is ready for Vercel as a static Vite deployment and requires no environment variables.</w:t>
+        <w:t>Clone the repository and open index.html directly in a modern browser. For a production bundle, run npm run build. The project is ready for Vercel as a static deployment and requires no environment variables.</w:t>
       </w:r>
     </w:p>
     <w:sectPr>

</xml_diff>

<commit_message>
Simplify submission metadata layout
</commit_message>
<xml_diff>
--- a/submission/Madhavik_Dogra_Founding_AI_Engineer_Assignment.docx
+++ b/submission/Madhavik_Dogra_Founding_AI_Engineer_Assignment.docx
@@ -47,169 +47,72 @@
         <w:t>An evidence-first planner for safe, multi-file engineering changes</w:t>
       </w:r>
     </w:p>
-    <w:tbl>
-      <w:tblPr>
-        <w:tblW w:type="dxa" w:w="9360"/>
-        <w:jc w:val="left"/>
-        <w:tblLayout w:type="fixed"/>
-        <w:tblLook w:firstColumn="1" w:firstRow="1" w:lastColumn="0" w:lastRow="0" w:noHBand="0" w:noVBand="1" w:val="04A0"/>
-        <w:tblInd w:w="120" w:type="dxa"/>
-      </w:tblPr>
-      <w:tblGrid>
-        <w:gridCol w:w="4680"/>
-        <w:gridCol w:w="4680"/>
-      </w:tblGrid>
-      <w:tr>
-        <w:tc>
-          <w:tcPr>
-            <w:tcW w:type="dxa" w:w="1400"/>
-            <w:tcMar>
-              <w:top w:w="80" w:type="dxa"/>
-              <w:start w:w="120" w:type="dxa"/>
-              <w:bottom w:w="80" w:type="dxa"/>
-              <w:end w:w="120" w:type="dxa"/>
-            </w:tcMar>
-            <w:vAlign w:val="center"/>
-            <w:shd w:fill="E8EEF5"/>
-          </w:tcPr>
-          <w:p>
-            <w:r/>
-            <w:r>
-              <w:rPr>
-                <w:rFonts w:ascii="Calibri" w:hAnsi="Calibri"/>
-                <w:b/>
-                <w:color w:val="1F4D78"/>
-                <w:sz w:val="20"/>
-              </w:rPr>
-              <w:t>Candidate</w:t>
-            </w:r>
-          </w:p>
-        </w:tc>
-        <w:tc>
-          <w:tcPr>
-            <w:tcW w:type="dxa" w:w="7960"/>
-            <w:tcMar>
-              <w:top w:w="80" w:type="dxa"/>
-              <w:start w:w="120" w:type="dxa"/>
-              <w:bottom w:w="80" w:type="dxa"/>
-              <w:end w:w="120" w:type="dxa"/>
-            </w:tcMar>
-            <w:vAlign w:val="center"/>
-          </w:tcPr>
-          <w:p>
-            <w:r/>
-            <w:r>
-              <w:rPr>
-                <w:rFonts w:ascii="Calibri" w:hAnsi="Calibri"/>
-                <w:color w:val="1D2530"/>
-                <w:sz w:val="20"/>
-              </w:rPr>
-              <w:t>Madhavik Dogra</w:t>
-            </w:r>
-          </w:p>
-        </w:tc>
-      </w:tr>
-      <w:tr>
-        <w:tc>
-          <w:tcPr>
-            <w:tcW w:type="dxa" w:w="1400"/>
-            <w:tcMar>
-              <w:top w:w="80" w:type="dxa"/>
-              <w:start w:w="120" w:type="dxa"/>
-              <w:bottom w:w="80" w:type="dxa"/>
-              <w:end w:w="120" w:type="dxa"/>
-            </w:tcMar>
-            <w:vAlign w:val="center"/>
-            <w:shd w:fill="E8EEF5"/>
-          </w:tcPr>
-          <w:p>
-            <w:r/>
-            <w:r>
-              <w:rPr>
-                <w:rFonts w:ascii="Calibri" w:hAnsi="Calibri"/>
-                <w:b/>
-                <w:color w:val="1F4D78"/>
-                <w:sz w:val="20"/>
-              </w:rPr>
-              <w:t>Repository</w:t>
-            </w:r>
-          </w:p>
-        </w:tc>
-        <w:tc>
-          <w:tcPr>
-            <w:tcW w:type="dxa" w:w="7960"/>
-            <w:tcMar>
-              <w:top w:w="80" w:type="dxa"/>
-              <w:start w:w="120" w:type="dxa"/>
-              <w:bottom w:w="80" w:type="dxa"/>
-              <w:end w:w="120" w:type="dxa"/>
-            </w:tcMar>
-            <w:vAlign w:val="center"/>
-          </w:tcPr>
-          <w:p>
-            <w:r/>
-            <w:r>
-              <w:rPr>
-                <w:rFonts w:ascii="Calibri" w:hAnsi="Calibri"/>
-                <w:color w:val="1D2530"/>
-                <w:sz w:val="20"/>
-              </w:rPr>
-              <w:t>https://github.com/madhav1k/changescope</w:t>
-            </w:r>
-          </w:p>
-        </w:tc>
-      </w:tr>
-      <w:tr>
-        <w:tc>
-          <w:tcPr>
-            <w:tcW w:type="dxa" w:w="1400"/>
-            <w:tcMar>
-              <w:top w:w="80" w:type="dxa"/>
-              <w:start w:w="120" w:type="dxa"/>
-              <w:bottom w:w="80" w:type="dxa"/>
-              <w:end w:w="120" w:type="dxa"/>
-            </w:tcMar>
-            <w:vAlign w:val="center"/>
-            <w:shd w:fill="E8EEF5"/>
-          </w:tcPr>
-          <w:p>
-            <w:r/>
-            <w:r>
-              <w:rPr>
-                <w:rFonts w:ascii="Calibri" w:hAnsi="Calibri"/>
-                <w:b/>
-                <w:color w:val="1F4D78"/>
-                <w:sz w:val="20"/>
-              </w:rPr>
-              <w:t>Deployment</w:t>
-            </w:r>
-          </w:p>
-        </w:tc>
-        <w:tc>
-          <w:tcPr>
-            <w:tcW w:type="dxa" w:w="7960"/>
-            <w:tcMar>
-              <w:top w:w="80" w:type="dxa"/>
-              <w:start w:w="120" w:type="dxa"/>
-              <w:bottom w:w="80" w:type="dxa"/>
-              <w:end w:w="120" w:type="dxa"/>
-            </w:tcMar>
-            <w:vAlign w:val="center"/>
-          </w:tcPr>
-          <w:p>
-            <w:r/>
-            <w:r>
-              <w:rPr>
-                <w:rFonts w:ascii="Calibri" w:hAnsi="Calibri"/>
-                <w:color w:val="1D2530"/>
-                <w:sz w:val="20"/>
-              </w:rPr>
-              <w:t>https://changescope.vercel.app</w:t>
-            </w:r>
-          </w:p>
-        </w:tc>
-      </w:tr>
-    </w:tbl>
+    <w:p>
+      <w:pPr>
+        <w:spacing w:after="80" w:line="264" w:lineRule="auto"/>
+      </w:pPr>
+      <w:r>
+        <w:rPr>
+          <w:rFonts w:ascii="Calibri" w:hAnsi="Calibri"/>
+          <w:b/>
+          <w:color w:val="1F4D78"/>
+          <w:sz w:val="21"/>
+        </w:rPr>
+        <w:t xml:space="preserve">Candidate: </w:t>
+      </w:r>
+      <w:r>
+        <w:rPr>
+          <w:rFonts w:ascii="Calibri" w:hAnsi="Calibri"/>
+          <w:color w:val="1D2530"/>
+          <w:sz w:val="21"/>
+        </w:rPr>
+        <w:t>Madhavik Dogra</w:t>
+      </w:r>
+    </w:p>
+    <w:p>
+      <w:pPr>
+        <w:spacing w:after="80" w:line="264" w:lineRule="auto"/>
+      </w:pPr>
+      <w:r>
+        <w:rPr>
+          <w:rFonts w:ascii="Calibri" w:hAnsi="Calibri"/>
+          <w:b/>
+          <w:color w:val="1F4D78"/>
+          <w:sz w:val="21"/>
+        </w:rPr>
+        <w:t xml:space="preserve">Repository: </w:t>
+      </w:r>
+      <w:r>
+        <w:rPr>
+          <w:rFonts w:ascii="Calibri" w:hAnsi="Calibri"/>
+          <w:color w:val="1D2530"/>
+          <w:sz w:val="21"/>
+        </w:rPr>
+        <w:t>https://github.com/madhav1k/changescope</w:t>
+      </w:r>
+    </w:p>
+    <w:p>
+      <w:pPr>
+        <w:spacing w:after="80" w:line="264" w:lineRule="auto"/>
+      </w:pPr>
+      <w:r>
+        <w:rPr>
+          <w:rFonts w:ascii="Calibri" w:hAnsi="Calibri"/>
+          <w:b/>
+          <w:color w:val="1F4D78"/>
+          <w:sz w:val="21"/>
+        </w:rPr>
+        <w:t xml:space="preserve">Deployment: </w:t>
+      </w:r>
+      <w:r>
+        <w:rPr>
+          <w:rFonts w:ascii="Calibri" w:hAnsi="Calibri"/>
+          <w:color w:val="1D2530"/>
+          <w:sz w:val="21"/>
+        </w:rPr>
+        <w:t>https://changescope.vercel.app</w:t>
+      </w:r>
+    </w:p>
     <w:p>
       <w:pPr>
         <w:pStyle w:val="Heading1"/>

</xml_diff>

<commit_message>
Use compatible numbered extension list
</commit_message>
<xml_diff>
--- a/submission/Madhavik_Dogra_Founding_AI_Engineer_Assignment.docx
+++ b/submission/Madhavik_Dogra_Founding_AI_Engineer_Assignment.docx
@@ -727,7 +727,7 @@
     </w:p>
     <w:p>
       <w:pPr>
-        <w:pStyle w:val="ListBullet"/>
+        <w:pStyle w:val="ListNumber"/>
         <w:spacing w:after="80"/>
       </w:pPr>
       <w:r>
@@ -736,7 +736,7 @@
     </w:p>
     <w:p>
       <w:pPr>
-        <w:pStyle w:val="ListBullet"/>
+        <w:pStyle w:val="ListNumber"/>
         <w:spacing w:after="80"/>
       </w:pPr>
       <w:r>
@@ -745,7 +745,7 @@
     </w:p>
     <w:p>
       <w:pPr>
-        <w:pStyle w:val="ListBullet"/>
+        <w:pStyle w:val="ListNumber"/>
         <w:spacing w:after="80"/>
       </w:pPr>
       <w:r>
@@ -754,7 +754,7 @@
     </w:p>
     <w:p>
       <w:pPr>
-        <w:pStyle w:val="ListBullet"/>
+        <w:pStyle w:val="ListNumber"/>
         <w:spacing w:after="80"/>
       </w:pPr>
       <w:r>

</xml_diff>

<commit_message>
Restart extension list numbering
</commit_message>
<xml_diff>
--- a/submission/Madhavik_Dogra_Founding_AI_Engineer_Assignment.docx
+++ b/submission/Madhavik_Dogra_Founding_AI_Engineer_Assignment.docx
@@ -729,6 +729,10 @@
       <w:pPr>
         <w:pStyle w:val="ListNumber"/>
         <w:spacing w:after="80"/>
+        <w:numPr>
+          <w:ilvl w:val="0"/>
+          <w:numId w:val="10"/>
+        </w:numPr>
       </w:pPr>
       <w:r>
         <w:t>Replace the scenario data with a repository adapter that indexes imports, routes, tests, ownership, and recent changes.</w:t>
@@ -738,6 +742,10 @@
       <w:pPr>
         <w:pStyle w:val="ListNumber"/>
         <w:spacing w:after="80"/>
+        <w:numPr>
+          <w:ilvl w:val="0"/>
+          <w:numId w:val="10"/>
+        </w:numPr>
       </w:pPr>
       <w:r>
         <w:t>Add a plan editor so a developer can change assumptions before approval.</w:t>
@@ -747,6 +755,10 @@
       <w:pPr>
         <w:pStyle w:val="ListNumber"/>
         <w:spacing w:after="80"/>
+        <w:numPr>
+          <w:ilvl w:val="0"/>
+          <w:numId w:val="10"/>
+        </w:numPr>
       </w:pPr>
       <w:r>
         <w:t>Connect an execution agent after approval, with real diffs and a test-run timeline.</w:t>
@@ -756,6 +768,10 @@
       <w:pPr>
         <w:pStyle w:val="ListNumber"/>
         <w:spacing w:after="80"/>
+        <w:numPr>
+          <w:ilvl w:val="0"/>
+          <w:numId w:val="10"/>
+        </w:numPr>
       </w:pPr>
       <w:r>
         <w:t>Add collaboration: reviewers can comment on a plan, pin required files, and approve high-risk changes.</w:t>
@@ -1035,6 +1051,9 @@
   </w:num>
   <w:num w:numId="9">
     <w:abstractNumId w:val="0"/>
+  </w:num>
+  <w:num w:numId="10">
+    <w:abstractNumId w:val="7"/>
   </w:num>
 </w:numbering>
 </file>

</xml_diff>

<commit_message>
Restore compatible numbered list rendering
</commit_message>
<xml_diff>
--- a/submission/Madhavik_Dogra_Founding_AI_Engineer_Assignment.docx
+++ b/submission/Madhavik_Dogra_Founding_AI_Engineer_Assignment.docx
@@ -729,10 +729,6 @@
       <w:pPr>
         <w:pStyle w:val="ListNumber"/>
         <w:spacing w:after="80"/>
-        <w:numPr>
-          <w:ilvl w:val="0"/>
-          <w:numId w:val="10"/>
-        </w:numPr>
       </w:pPr>
       <w:r>
         <w:t>Replace the scenario data with a repository adapter that indexes imports, routes, tests, ownership, and recent changes.</w:t>
@@ -742,10 +738,6 @@
       <w:pPr>
         <w:pStyle w:val="ListNumber"/>
         <w:spacing w:after="80"/>
-        <w:numPr>
-          <w:ilvl w:val="0"/>
-          <w:numId w:val="10"/>
-        </w:numPr>
       </w:pPr>
       <w:r>
         <w:t>Add a plan editor so a developer can change assumptions before approval.</w:t>
@@ -755,10 +747,6 @@
       <w:pPr>
         <w:pStyle w:val="ListNumber"/>
         <w:spacing w:after="80"/>
-        <w:numPr>
-          <w:ilvl w:val="0"/>
-          <w:numId w:val="10"/>
-        </w:numPr>
       </w:pPr>
       <w:r>
         <w:t>Connect an execution agent after approval, with real diffs and a test-run timeline.</w:t>
@@ -768,10 +756,6 @@
       <w:pPr>
         <w:pStyle w:val="ListNumber"/>
         <w:spacing w:after="80"/>
-        <w:numPr>
-          <w:ilvl w:val="0"/>
-          <w:numId w:val="10"/>
-        </w:numPr>
       </w:pPr>
       <w:r>
         <w:t>Add collaboration: reviewers can comment on a plan, pin required files, and approve high-risk changes.</w:t>
@@ -1051,9 +1035,6 @@
   </w:num>
   <w:num w:numId="9">
     <w:abstractNumId w:val="0"/>
-  </w:num>
-  <w:num w:numId="10">
-    <w:abstractNumId w:val="7"/>
   </w:num>
 </w:numbering>
 </file>

</xml_diff>

<commit_message>
Polish document flow and numbering
</commit_message>
<xml_diff>
--- a/submission/Madhavik_Dogra_Founding_AI_Engineer_Assignment.docx
+++ b/submission/Madhavik_Dogra_Founding_AI_Engineer_Assignment.docx
@@ -161,7 +161,7 @@
     </w:p>
     <w:p>
       <w:pPr>
-        <w:pStyle w:val="ListNumber"/>
+        <w:pStyle w:val="ListNumber2"/>
         <w:spacing w:after="80"/>
       </w:pPr>
       <w:r>
@@ -170,7 +170,7 @@
     </w:p>
     <w:p>
       <w:pPr>
-        <w:pStyle w:val="ListNumber"/>
+        <w:pStyle w:val="ListNumber2"/>
         <w:spacing w:after="80"/>
       </w:pPr>
       <w:r>
@@ -179,7 +179,7 @@
     </w:p>
     <w:p>
       <w:pPr>
-        <w:pStyle w:val="ListNumber"/>
+        <w:pStyle w:val="ListNumber2"/>
         <w:spacing w:after="80"/>
       </w:pPr>
       <w:r>
@@ -188,16 +188,11 @@
     </w:p>
     <w:p>
       <w:pPr>
-        <w:pStyle w:val="ListNumber"/>
+        <w:pStyle w:val="ListNumber2"/>
         <w:spacing w:after="80"/>
       </w:pPr>
       <w:r>
         <w:t>Approve the plan explicitly. The demo confirms that the plan is ready to hand to an execution agent, while preserving human control.</w:t>
-      </w:r>
-    </w:p>
-    <w:p>
-      <w:r>
-        <w:br w:type="page"/>
       </w:r>
     </w:p>
     <w:p>
@@ -237,6 +232,9 @@
         <w:gridCol w:w="3120"/>
       </w:tblGrid>
       <w:tr>
+        <w:trPr>
+          <w:tblHeader w:val="true"/>
+        </w:trPr>
         <w:tc>
           <w:tcPr>
             <w:tcW w:type="dxa" w:w="2200"/>

</xml_diff>

<commit_message>
Improve architecture section document flow
</commit_message>
<xml_diff>
--- a/submission/Madhavik_Dogra_Founding_AI_Engineer_Assignment.docx
+++ b/submission/Madhavik_Dogra_Founding_AI_Engineer_Assignment.docx
@@ -218,350 +218,161 @@
         <w:t>ChangeScope is a standalone static application written in vanilla HTML, CSS, and JavaScript. It has no server, database, authentication layer, or external API requirement. This is intentional: for an assignment demo, I wanted the central product interaction to be reliable, inspectable, and deployable at zero marginal cost.</w:t>
       </w:r>
     </w:p>
-    <w:tbl>
-      <w:tblPr>
-        <w:tblW w:type="dxa" w:w="9360"/>
-        <w:jc w:val="left"/>
-        <w:tblLayout w:type="fixed"/>
-        <w:tblLook w:firstColumn="1" w:firstRow="1" w:lastColumn="0" w:lastRow="0" w:noHBand="0" w:noVBand="1" w:val="04A0"/>
-        <w:tblInd w:w="120" w:type="dxa"/>
-      </w:tblPr>
-      <w:tblGrid>
-        <w:gridCol w:w="3120"/>
-        <w:gridCol w:w="3120"/>
-        <w:gridCol w:w="3120"/>
-      </w:tblGrid>
-      <w:tr>
-        <w:trPr>
-          <w:tblHeader w:val="true"/>
-        </w:trPr>
-        <w:tc>
-          <w:tcPr>
-            <w:tcW w:type="dxa" w:w="2200"/>
-            <w:tcMar>
-              <w:top w:w="80" w:type="dxa"/>
-              <w:start w:w="120" w:type="dxa"/>
-              <w:bottom w:w="80" w:type="dxa"/>
-              <w:end w:w="120" w:type="dxa"/>
-            </w:tcMar>
-            <w:vAlign w:val="center"/>
-            <w:shd w:fill="E8EEF5"/>
-          </w:tcPr>
-          <w:p>
-            <w:r/>
-            <w:r>
-              <w:rPr>
-                <w:rFonts w:ascii="Calibri" w:hAnsi="Calibri"/>
-                <w:b/>
-                <w:color w:val="1F4D78"/>
-                <w:sz w:val="20"/>
-              </w:rPr>
-              <w:t>Layer</w:t>
-            </w:r>
-          </w:p>
-        </w:tc>
-        <w:tc>
-          <w:tcPr>
-            <w:tcW w:type="dxa" w:w="3900"/>
-            <w:tcMar>
-              <w:top w:w="80" w:type="dxa"/>
-              <w:start w:w="120" w:type="dxa"/>
-              <w:bottom w:w="80" w:type="dxa"/>
-              <w:end w:w="120" w:type="dxa"/>
-            </w:tcMar>
-            <w:vAlign w:val="center"/>
-            <w:shd w:fill="E8EEF5"/>
-          </w:tcPr>
-          <w:p>
-            <w:r/>
-            <w:r>
-              <w:rPr>
-                <w:rFonts w:ascii="Calibri" w:hAnsi="Calibri"/>
-                <w:b/>
-                <w:color w:val="1F4D78"/>
-                <w:sz w:val="20"/>
-              </w:rPr>
-              <w:t>Decision</w:t>
-            </w:r>
-          </w:p>
-        </w:tc>
-        <w:tc>
-          <w:tcPr>
-            <w:tcW w:type="dxa" w:w="3260"/>
-            <w:tcMar>
-              <w:top w:w="80" w:type="dxa"/>
-              <w:start w:w="120" w:type="dxa"/>
-              <w:bottom w:w="80" w:type="dxa"/>
-              <w:end w:w="120" w:type="dxa"/>
-            </w:tcMar>
-            <w:vAlign w:val="center"/>
-            <w:shd w:fill="E8EEF5"/>
-          </w:tcPr>
-          <w:p>
-            <w:r/>
-            <w:r>
-              <w:rPr>
-                <w:rFonts w:ascii="Calibri" w:hAnsi="Calibri"/>
-                <w:b/>
-                <w:color w:val="1F4D78"/>
-                <w:sz w:val="20"/>
-              </w:rPr>
-              <w:t>Why</w:t>
-            </w:r>
-          </w:p>
-        </w:tc>
-      </w:tr>
-      <w:tr>
-        <w:tc>
-          <w:tcPr>
-            <w:tcW w:type="dxa" w:w="3120"/>
-          </w:tcPr>
-          <w:p>
-            <w:r/>
-            <w:r>
-              <w:rPr>
-                <w:rFonts w:ascii="Calibri" w:hAnsi="Calibri"/>
-                <w:color w:val="1D2530"/>
-                <w:sz w:val="19"/>
-              </w:rPr>
-              <w:t>Interface</w:t>
-            </w:r>
-          </w:p>
-        </w:tc>
-        <w:tc>
-          <w:tcPr>
-            <w:tcW w:type="dxa" w:w="3120"/>
-          </w:tcPr>
-          <w:p>
-            <w:r/>
-            <w:r>
-              <w:rPr>
-                <w:rFonts w:ascii="Calibri" w:hAnsi="Calibri"/>
-                <w:color w:val="1D2530"/>
-                <w:sz w:val="19"/>
-              </w:rPr>
-              <w:t>Single-screen analysis workspace</w:t>
-            </w:r>
-          </w:p>
-        </w:tc>
-        <w:tc>
-          <w:tcPr>
-            <w:tcW w:type="dxa" w:w="3120"/>
-          </w:tcPr>
-          <w:p>
-            <w:r/>
-            <w:r>
-              <w:rPr>
-                <w:rFonts w:ascii="Calibri" w:hAnsi="Calibri"/>
-                <w:color w:val="1D2530"/>
-                <w:sz w:val="19"/>
-              </w:rPr>
-              <w:t>Keeps the journey visible: issue, context, plan, proof, approval.</w:t>
-            </w:r>
-          </w:p>
-        </w:tc>
-      </w:tr>
-      <w:tr>
-        <w:tc>
-          <w:tcPr>
-            <w:tcW w:type="dxa" w:w="3120"/>
-          </w:tcPr>
-          <w:p>
-            <w:r/>
-            <w:r>
-              <w:rPr>
-                <w:rFonts w:ascii="Calibri" w:hAnsi="Calibri"/>
-                <w:color w:val="1D2530"/>
-                <w:sz w:val="19"/>
-              </w:rPr>
-              <w:t>Scenario engine</w:t>
-            </w:r>
-          </w:p>
-        </w:tc>
-        <w:tc>
-          <w:tcPr>
-            <w:tcW w:type="dxa" w:w="3120"/>
-          </w:tcPr>
-          <w:p>
-            <w:r/>
-            <w:r>
-              <w:rPr>
-                <w:rFonts w:ascii="Calibri" w:hAnsi="Calibri"/>
-                <w:color w:val="1D2530"/>
-                <w:sz w:val="19"/>
-              </w:rPr>
-              <w:t>Three deterministic scenarios</w:t>
-            </w:r>
-          </w:p>
-        </w:tc>
-        <w:tc>
-          <w:tcPr>
-            <w:tcW w:type="dxa" w:w="3120"/>
-          </w:tcPr>
-          <w:p>
-            <w:r/>
-            <w:r>
-              <w:rPr>
-                <w:rFonts w:ascii="Calibri" w:hAnsi="Calibri"/>
-                <w:color w:val="1D2530"/>
-                <w:sz w:val="19"/>
-              </w:rPr>
-              <w:t>Lets a reviewer test meaningful paths without API cost, keys, latency, or fabricated model behavior.</w:t>
-            </w:r>
-          </w:p>
-        </w:tc>
-      </w:tr>
-      <w:tr>
-        <w:tc>
-          <w:tcPr>
-            <w:tcW w:type="dxa" w:w="3120"/>
-          </w:tcPr>
-          <w:p>
-            <w:r/>
-            <w:r>
-              <w:rPr>
-                <w:rFonts w:ascii="Calibri" w:hAnsi="Calibri"/>
-                <w:color w:val="1D2530"/>
-                <w:sz w:val="19"/>
-              </w:rPr>
-              <w:t>Change map</w:t>
-            </w:r>
-          </w:p>
-        </w:tc>
-        <w:tc>
-          <w:tcPr>
-            <w:tcW w:type="dxa" w:w="3120"/>
-          </w:tcPr>
-          <w:p>
-            <w:r/>
-            <w:r>
-              <w:rPr>
-                <w:rFonts w:ascii="Calibri" w:hAnsi="Calibri"/>
-                <w:color w:val="1D2530"/>
-                <w:sz w:val="19"/>
-              </w:rPr>
-              <w:t>Rendered dependency graph</w:t>
-            </w:r>
-          </w:p>
-        </w:tc>
-        <w:tc>
-          <w:tcPr>
-            <w:tcW w:type="dxa" w:w="3120"/>
-          </w:tcPr>
-          <w:p>
-            <w:r/>
-            <w:r>
-              <w:rPr>
-                <w:rFonts w:ascii="Calibri" w:hAnsi="Calibri"/>
-                <w:color w:val="1D2530"/>
-                <w:sz w:val="19"/>
-              </w:rPr>
-              <w:t>Makes the implied blast radius concrete and allows the plan to be challenged.</w:t>
-            </w:r>
-          </w:p>
-        </w:tc>
-      </w:tr>
-      <w:tr>
-        <w:tc>
-          <w:tcPr>
-            <w:tcW w:type="dxa" w:w="3120"/>
-          </w:tcPr>
-          <w:p>
-            <w:r/>
-            <w:r>
-              <w:rPr>
-                <w:rFonts w:ascii="Calibri" w:hAnsi="Calibri"/>
-                <w:color w:val="1D2530"/>
-                <w:sz w:val="19"/>
-              </w:rPr>
-              <w:t>Trust model</w:t>
-            </w:r>
-          </w:p>
-        </w:tc>
-        <w:tc>
-          <w:tcPr>
-            <w:tcW w:type="dxa" w:w="3120"/>
-          </w:tcPr>
-          <w:p>
-            <w:r/>
-            <w:r>
-              <w:rPr>
-                <w:rFonts w:ascii="Calibri" w:hAnsi="Calibri"/>
-                <w:color w:val="1D2530"/>
-                <w:sz w:val="19"/>
-              </w:rPr>
-              <w:t>Evidence and approval are first-class</w:t>
-            </w:r>
-          </w:p>
-        </w:tc>
-        <w:tc>
-          <w:tcPr>
-            <w:tcW w:type="dxa" w:w="3120"/>
-          </w:tcPr>
-          <w:p>
-            <w:r/>
-            <w:r>
-              <w:rPr>
-                <w:rFonts w:ascii="Calibri" w:hAnsi="Calibri"/>
-                <w:color w:val="1D2530"/>
-                <w:sz w:val="19"/>
-              </w:rPr>
-              <w:t>Agent output should remain reviewable and controllable, particularly for authorization and billing work.</w:t>
-            </w:r>
-          </w:p>
-        </w:tc>
-      </w:tr>
-      <w:tr>
-        <w:tc>
-          <w:tcPr>
-            <w:tcW w:type="dxa" w:w="3120"/>
-          </w:tcPr>
-          <w:p>
-            <w:r/>
-            <w:r>
-              <w:rPr>
-                <w:rFonts w:ascii="Calibri" w:hAnsi="Calibri"/>
-                <w:color w:val="1D2530"/>
-                <w:sz w:val="19"/>
-              </w:rPr>
-              <w:t>Deployment</w:t>
-            </w:r>
-          </w:p>
-        </w:tc>
-        <w:tc>
-          <w:tcPr>
-            <w:tcW w:type="dxa" w:w="3120"/>
-          </w:tcPr>
-          <w:p>
-            <w:r/>
-            <w:r>
-              <w:rPr>
-                <w:rFonts w:ascii="Calibri" w:hAnsi="Calibri"/>
-                <w:color w:val="1D2530"/>
-                <w:sz w:val="19"/>
-              </w:rPr>
-              <w:t>Static Vercel-compatible build</w:t>
-            </w:r>
-          </w:p>
-        </w:tc>
-        <w:tc>
-          <w:tcPr>
-            <w:tcW w:type="dxa" w:w="3120"/>
-          </w:tcPr>
-          <w:p>
-            <w:r/>
-            <w:r>
-              <w:rPr>
-                <w:rFonts w:ascii="Calibri" w:hAnsi="Calibri"/>
-                <w:color w:val="1D2530"/>
-                <w:sz w:val="19"/>
-              </w:rPr>
-              <w:t>No environment variables or backend setup are needed to run the submission.</w:t>
-            </w:r>
-          </w:p>
-        </w:tc>
-      </w:tr>
-    </w:tbl>
+    <w:p>
+      <w:pPr>
+        <w:spacing w:after="100" w:line="264" w:lineRule="auto"/>
+      </w:pPr>
+      <w:r>
+        <w:rPr>
+          <w:rFonts w:ascii="Calibri" w:hAnsi="Calibri"/>
+          <w:b/>
+          <w:color w:val="1F4D78"/>
+          <w:sz w:val="21"/>
+        </w:rPr>
+        <w:t xml:space="preserve">Interface. </w:t>
+      </w:r>
+      <w:r>
+        <w:rPr>
+          <w:rFonts w:ascii="Calibri" w:hAnsi="Calibri"/>
+          <w:b/>
+          <w:color w:val="1D2530"/>
+          <w:sz w:val="21"/>
+        </w:rPr>
+        <w:t xml:space="preserve">Single-screen analysis workspace. </w:t>
+      </w:r>
+      <w:r>
+        <w:rPr>
+          <w:rFonts w:ascii="Calibri" w:hAnsi="Calibri"/>
+          <w:color w:val="1D2530"/>
+          <w:sz w:val="21"/>
+        </w:rPr>
+        <w:t>Keeps the journey visible: issue, context, plan, proof, and approval.</w:t>
+      </w:r>
+    </w:p>
+    <w:p>
+      <w:pPr>
+        <w:spacing w:after="100" w:line="264" w:lineRule="auto"/>
+      </w:pPr>
+      <w:r>
+        <w:rPr>
+          <w:rFonts w:ascii="Calibri" w:hAnsi="Calibri"/>
+          <w:b/>
+          <w:color w:val="1F4D78"/>
+          <w:sz w:val="21"/>
+        </w:rPr>
+        <w:t xml:space="preserve">Scenario engine. </w:t>
+      </w:r>
+      <w:r>
+        <w:rPr>
+          <w:rFonts w:ascii="Calibri" w:hAnsi="Calibri"/>
+          <w:b/>
+          <w:color w:val="1D2530"/>
+          <w:sz w:val="21"/>
+        </w:rPr>
+        <w:t xml:space="preserve">Three deterministic scenarios. </w:t>
+      </w:r>
+      <w:r>
+        <w:rPr>
+          <w:rFonts w:ascii="Calibri" w:hAnsi="Calibri"/>
+          <w:color w:val="1D2530"/>
+          <w:sz w:val="21"/>
+        </w:rPr>
+        <w:t>Lets a reviewer test meaningful paths without API cost, keys, latency, or fabricated model behavior.</w:t>
+      </w:r>
+    </w:p>
+    <w:p>
+      <w:pPr>
+        <w:spacing w:after="100" w:line="264" w:lineRule="auto"/>
+      </w:pPr>
+      <w:r>
+        <w:rPr>
+          <w:rFonts w:ascii="Calibri" w:hAnsi="Calibri"/>
+          <w:b/>
+          <w:color w:val="1F4D78"/>
+          <w:sz w:val="21"/>
+        </w:rPr>
+        <w:t xml:space="preserve">Change map. </w:t>
+      </w:r>
+      <w:r>
+        <w:rPr>
+          <w:rFonts w:ascii="Calibri" w:hAnsi="Calibri"/>
+          <w:b/>
+          <w:color w:val="1D2530"/>
+          <w:sz w:val="21"/>
+        </w:rPr>
+        <w:t xml:space="preserve">Rendered dependency graph. </w:t>
+      </w:r>
+      <w:r>
+        <w:rPr>
+          <w:rFonts w:ascii="Calibri" w:hAnsi="Calibri"/>
+          <w:color w:val="1D2530"/>
+          <w:sz w:val="21"/>
+        </w:rPr>
+        <w:t>Makes the implied blast radius concrete and allows the plan to be challenged.</w:t>
+      </w:r>
+    </w:p>
+    <w:p>
+      <w:pPr>
+        <w:spacing w:after="100" w:line="264" w:lineRule="auto"/>
+      </w:pPr>
+      <w:r>
+        <w:rPr>
+          <w:rFonts w:ascii="Calibri" w:hAnsi="Calibri"/>
+          <w:b/>
+          <w:color w:val="1F4D78"/>
+          <w:sz w:val="21"/>
+        </w:rPr>
+        <w:t xml:space="preserve">Trust model. </w:t>
+      </w:r>
+      <w:r>
+        <w:rPr>
+          <w:rFonts w:ascii="Calibri" w:hAnsi="Calibri"/>
+          <w:b/>
+          <w:color w:val="1D2530"/>
+          <w:sz w:val="21"/>
+        </w:rPr>
+        <w:t xml:space="preserve">Evidence and approval are first-class. </w:t>
+      </w:r>
+      <w:r>
+        <w:rPr>
+          <w:rFonts w:ascii="Calibri" w:hAnsi="Calibri"/>
+          <w:color w:val="1D2530"/>
+          <w:sz w:val="21"/>
+        </w:rPr>
+        <w:t>Keeps agent output reviewable and controllable for authorization and billing work.</w:t>
+      </w:r>
+    </w:p>
+    <w:p>
+      <w:pPr>
+        <w:spacing w:after="100" w:line="264" w:lineRule="auto"/>
+      </w:pPr>
+      <w:r>
+        <w:rPr>
+          <w:rFonts w:ascii="Calibri" w:hAnsi="Calibri"/>
+          <w:b/>
+          <w:color w:val="1F4D78"/>
+          <w:sz w:val="21"/>
+        </w:rPr>
+        <w:t xml:space="preserve">Deployment. </w:t>
+      </w:r>
+      <w:r>
+        <w:rPr>
+          <w:rFonts w:ascii="Calibri" w:hAnsi="Calibri"/>
+          <w:b/>
+          <w:color w:val="1D2530"/>
+          <w:sz w:val="21"/>
+        </w:rPr>
+        <w:t xml:space="preserve">Static Vercel-compatible build. </w:t>
+      </w:r>
+      <w:r>
+        <w:rPr>
+          <w:rFonts w:ascii="Calibri" w:hAnsi="Calibri"/>
+          <w:color w:val="1D2530"/>
+          <w:sz w:val="21"/>
+        </w:rPr>
+        <w:t>Needs no environment variables or backend setup.</w:t>
+      </w:r>
+    </w:p>
     <w:p>
       <w:pPr>
         <w:pStyle w:val="Heading1"/>

</xml_diff>

<commit_message>
Finalize submission content and PDF export
</commit_message>
<xml_diff>
--- a/submission/Madhavik_Dogra_Founding_AI_Engineer_Assignment.docx
+++ b/submission/Madhavik_Dogra_Founding_AI_Engineer_Assignment.docx
@@ -149,6 +149,44 @@
           <w:sz w:val="22"/>
         </w:rPr>
         <w:t>I chose this because the difficult part of agentic engineering is not producing a patch. It is deciding what deserves context, showing why a recommendation is trustworthy, and making the final action controllable. The prototype makes those steps visible instead of hiding them behind a chat response.</w:t>
+      </w:r>
+    </w:p>
+    <w:p>
+      <w:pPr>
+        <w:pStyle w:val="Heading1"/>
+      </w:pPr>
+      <w:r>
+        <w:t>My understanding of Superbrain</w:t>
+      </w:r>
+    </w:p>
+    <w:p>
+      <w:pPr>
+        <w:spacing w:before="0" w:after="120" w:line="264" w:lineRule="auto"/>
+      </w:pPr>
+      <w:r>
+        <w:rPr>
+          <w:rFonts w:ascii="Calibri" w:hAnsi="Calibri"/>
+          <w:b w:val="0"/>
+          <w:i w:val="0"/>
+          <w:color w:val="1D2530"/>
+          <w:sz w:val="22"/>
+        </w:rPr>
+        <w:t>I see Superbrain as three layers working together. The IDE is the developer-facing surface where intent, relevant context, and review are visible. The agent turns that intent into a plan, edits, commands, and verification work. The context engine sits underneath: it selects and compresses the repository knowledge the agent needs so the agent can reason across files without loading the full codebase every time.</w:t>
+      </w:r>
+    </w:p>
+    <w:p>
+      <w:pPr>
+        <w:spacing w:before="0" w:after="120" w:line="264" w:lineRule="auto"/>
+      </w:pPr>
+      <w:r>
+        <w:rPr>
+          <w:rFonts w:ascii="Calibri" w:hAnsi="Calibri"/>
+          <w:b w:val="0"/>
+          <w:i w:val="0"/>
+          <w:color w:val="1D2530"/>
+          <w:sz w:val="22"/>
+        </w:rPr>
+        <w:t>The key product loop is: a developer describes a change in the IDE, the agent asks the context engine for the relevant architecture and dependencies, the agent proposes or executes work, and the developer reviews the result. ChangeScope focuses on the decision surface between retrieval and execution. It explains why these files matter, what might break, and what proof should be required.</w:t>
       </w:r>
     </w:p>
     <w:p>
@@ -401,7 +439,7 @@
           <w:color w:val="1D2530"/>
           <w:sz w:val="22"/>
         </w:rPr>
-        <w:t>I did not try to recreate a coding agent. That would create a shallow product with a chat box and little evidence of judgement. Instead, I scoped the product to the decision immediately before execution: deciding the change boundary and defining what proof is needed.</w:t>
+        <w:t>I did not try to recreate a coding agent. That would create a shallow product with a chat box and little evidence of judgement. Instead, I scoped the product to the decision immediately before execution. The work is deciding the change boundary and defining what proof is needed.</w:t>
       </w:r>
     </w:p>
     <w:p>
@@ -508,7 +546,7 @@
           <w:color w:val="1D2530"/>
           <w:sz w:val="22"/>
         </w:rPr>
-        <w:t>My main product preference is for interfaces that make state and control obvious. For this category, users should always be able to answer: What has the agent understood? What is it about to do? What changed? How can I approve, interrupt, or revise it? A clear plan-review-execute-verify progression would reduce the cognitive load of long agent sessions.</w:t>
+        <w:t>My main product preference is for interfaces that make state and control obvious. In this category, a user should always be able to answer: What has the agent understood? What is it about to do? What changed? How can I approve, interrupt, or revise it? A clear plan-review-execute-verify progression would reduce the cognitive load of long agent sessions.</w:t>
       </w:r>
     </w:p>
     <w:p>

</xml_diff>